<commit_message>
Studentgrader vsCode project added
</commit_message>
<xml_diff>
--- a/JavaTutorial/Day3_OOPs.docx
+++ b/JavaTutorial/Day3_OOPs.docx
@@ -5549,58 +5549,40 @@
               <w:rPr>
                 <w:noProof/>
               </w:rPr>
-              <w:t xml:space="preserve">       </w:t>
-            </w:r>
-            <w:r>
-              <w:rPr>
-                <w:noProof/>
-              </w:rPr>
-              <w:t>String s1 = new String("Apple");</w:t>
-            </w:r>
-          </w:p>
-          <w:p>
-            <w:pPr>
-              <w:rPr>
-                <w:noProof/>
-              </w:rPr>
-            </w:pPr>
-            <w:r>
-              <w:rPr>
-                <w:noProof/>
-              </w:rPr>
-              <w:t xml:space="preserve">       </w:t>
-            </w:r>
-            <w:r>
-              <w:rPr>
-                <w:noProof/>
-              </w:rPr>
-              <w:t>String s2 = new String("Apple");</w:t>
-            </w:r>
-          </w:p>
-          <w:p>
-            <w:pPr>
-              <w:rPr>
-                <w:noProof/>
-              </w:rPr>
-            </w:pPr>
-          </w:p>
-          <w:p>
-            <w:pPr>
-              <w:rPr>
-                <w:noProof/>
-              </w:rPr>
-            </w:pPr>
-            <w:r>
-              <w:rPr>
-                <w:noProof/>
-              </w:rPr>
-              <w:t xml:space="preserve">      </w:t>
-            </w:r>
-            <w:r>
-              <w:rPr>
-                <w:noProof/>
-              </w:rPr>
-              <w:t xml:space="preserve">System.out.println(s1 == s2);      // </w:t>
+              <w:t xml:space="preserve">       String s1 = new String("Apple");</w:t>
+            </w:r>
+          </w:p>
+          <w:p>
+            <w:pPr>
+              <w:rPr>
+                <w:noProof/>
+              </w:rPr>
+            </w:pPr>
+            <w:r>
+              <w:rPr>
+                <w:noProof/>
+              </w:rPr>
+              <w:t xml:space="preserve">       String s2 = new String("Apple");</w:t>
+            </w:r>
+          </w:p>
+          <w:p>
+            <w:pPr>
+              <w:rPr>
+                <w:noProof/>
+              </w:rPr>
+            </w:pPr>
+          </w:p>
+          <w:p>
+            <w:pPr>
+              <w:rPr>
+                <w:noProof/>
+              </w:rPr>
+            </w:pPr>
+            <w:r>
+              <w:rPr>
+                <w:noProof/>
+              </w:rPr>
+              <w:t xml:space="preserve">      System.out.println(s1 == s2);      // </w:t>
             </w:r>
             <w:r>
               <w:rPr>
@@ -5626,13 +5608,7 @@
               <w:rPr>
                 <w:noProof/>
               </w:rPr>
-              <w:t xml:space="preserve">      </w:t>
-            </w:r>
-            <w:r>
-              <w:rPr>
-                <w:noProof/>
-              </w:rPr>
-              <w:t>System.out.println(s1.equals(s2)); //  Prints true (same characters)</w:t>
+              <w:t xml:space="preserve">      System.out.println(s1.equals(s2)); //  Prints true (same characters)</w:t>
             </w:r>
           </w:p>
           <w:p>
@@ -6161,6 +6137,34 @@
       <w:proofErr w:type="gramEnd"/>
       <w:r>
         <w:t xml:space="preserve"> not have access to data of another ideas class. Data is protected and only member functions have access to data.</w:t>
+      </w:r>
+    </w:p>
+    <w:p>
+      <w:r>
+        <w:t xml:space="preserve">Video link: </w:t>
+      </w:r>
+      <w:hyperlink r:id="rId20" w:history="1">
+        <w:r>
+          <w:rPr>
+            <w:rStyle w:val="Hyperlink"/>
+          </w:rPr>
+          <w:t>https://www.youtube.com/watch?v=m_MQYyJpIjg</w:t>
+        </w:r>
+      </w:hyperlink>
+      <w:r>
+        <w:br/>
+        <w:t xml:space="preserve">                       </w:t>
+      </w:r>
+      <w:hyperlink r:id="rId21" w:history="1">
+        <w:r>
+          <w:rPr>
+            <w:rStyle w:val="Hyperlink"/>
+          </w:rPr>
+          <w:t>https://www.youtube.com/watch?v=_x8Cyc9k4wk</w:t>
+        </w:r>
+      </w:hyperlink>
+      <w:r>
+        <w:t xml:space="preserve"> </w:t>
       </w:r>
     </w:p>
     <w:tbl>
@@ -6220,7 +6224,7 @@
                           <pic:cNvPicPr/>
                         </pic:nvPicPr>
                         <pic:blipFill>
-                          <a:blip r:embed="rId20"/>
+                          <a:blip r:embed="rId22"/>
                           <a:stretch>
                             <a:fillRect/>
                           </a:stretch>
@@ -6270,7 +6274,7 @@
                           </pic:cNvPicPr>
                         </pic:nvPicPr>
                         <pic:blipFill>
-                          <a:blip r:embed="rId21">
+                          <a:blip r:embed="rId23">
                             <a:extLst>
                               <a:ext uri="{28A0092B-C50C-407E-A947-70E740481C1C}">
                                 <a14:useLocalDpi xmlns:a14="http://schemas.microsoft.com/office/drawing/2010/main" val="0"/>
@@ -6329,7 +6333,7 @@
                           <pic:cNvPicPr/>
                         </pic:nvPicPr>
                         <pic:blipFill>
-                          <a:blip r:embed="rId22"/>
+                          <a:blip r:embed="rId24"/>
                           <a:stretch>
                             <a:fillRect/>
                           </a:stretch>
@@ -6412,7 +6416,7 @@
                           <pic:cNvPicPr/>
                         </pic:nvPicPr>
                         <pic:blipFill>
-                          <a:blip r:embed="rId23"/>
+                          <a:blip r:embed="rId25"/>
                           <a:stretch>
                             <a:fillRect/>
                           </a:stretch>
@@ -6460,7 +6464,7 @@
                           <pic:cNvPicPr/>
                         </pic:nvPicPr>
                         <pic:blipFill>
-                          <a:blip r:embed="rId24"/>
+                          <a:blip r:embed="rId26"/>
                           <a:stretch>
                             <a:fillRect/>
                           </a:stretch>
@@ -6588,7 +6592,7 @@
                                 <pic:cNvPicPr/>
                               </pic:nvPicPr>
                               <pic:blipFill>
-                                <a:blip r:embed="rId25"/>
+                                <a:blip r:embed="rId27"/>
                                 <a:stretch>
                                   <a:fillRect/>
                                 </a:stretch>
@@ -6636,7 +6640,7 @@
                                 <pic:cNvPicPr/>
                               </pic:nvPicPr>
                               <pic:blipFill>
-                                <a:blip r:embed="rId26"/>
+                                <a:blip r:embed="rId28"/>
                                 <a:stretch>
                                   <a:fillRect/>
                                 </a:stretch>
@@ -6800,7 +6804,7 @@
                           <pic:cNvPicPr/>
                         </pic:nvPicPr>
                         <pic:blipFill>
-                          <a:blip r:embed="rId27"/>
+                          <a:blip r:embed="rId29"/>
                           <a:stretch>
                             <a:fillRect/>
                           </a:stretch>
@@ -6952,7 +6956,7 @@
                           <pic:cNvPicPr/>
                         </pic:nvPicPr>
                         <pic:blipFill>
-                          <a:blip r:embed="rId28"/>
+                          <a:blip r:embed="rId30"/>
                           <a:stretch>
                             <a:fillRect/>
                           </a:stretch>
@@ -7085,7 +7089,7 @@
                           <pic:cNvPicPr/>
                         </pic:nvPicPr>
                         <pic:blipFill>
-                          <a:blip r:embed="rId29"/>
+                          <a:blip r:embed="rId31"/>
                           <a:stretch>
                             <a:fillRect/>
                           </a:stretch>
@@ -7250,7 +7254,7 @@
                           <pic:cNvPicPr/>
                         </pic:nvPicPr>
                         <pic:blipFill>
-                          <a:blip r:embed="rId30"/>
+                          <a:blip r:embed="rId32"/>
                           <a:stretch>
                             <a:fillRect/>
                           </a:stretch>
@@ -7300,7 +7304,7 @@
                           <pic:cNvPicPr/>
                         </pic:nvPicPr>
                         <pic:blipFill>
-                          <a:blip r:embed="rId31"/>
+                          <a:blip r:embed="rId33"/>
                           <a:stretch>
                             <a:fillRect/>
                           </a:stretch>
@@ -7373,7 +7377,7 @@
                           <pic:cNvPicPr/>
                         </pic:nvPicPr>
                         <pic:blipFill>
-                          <a:blip r:embed="rId32"/>
+                          <a:blip r:embed="rId34"/>
                           <a:stretch>
                             <a:fillRect/>
                           </a:stretch>
@@ -7507,7 +7511,7 @@
                           <pic:cNvPicPr/>
                         </pic:nvPicPr>
                         <pic:blipFill>
-                          <a:blip r:embed="rId33"/>
+                          <a:blip r:embed="rId35"/>
                           <a:stretch>
                             <a:fillRect/>
                           </a:stretch>
@@ -7791,7 +7795,7 @@
                     <pic:cNvPicPr/>
                   </pic:nvPicPr>
                   <pic:blipFill>
-                    <a:blip r:embed="rId34"/>
+                    <a:blip r:embed="rId36"/>
                     <a:stretch>
                       <a:fillRect/>
                     </a:stretch>
@@ -7866,83 +7870,6 @@
             <w:r>
               <w:t xml:space="preserve"> level of access. Anything declared as public can be seen and used by any other class in your entire project. [</w:t>
             </w:r>
-            <w:hyperlink r:id="rId35" w:history="1">
-              <w:r>
-                <w:rPr>
-                  <w:rStyle w:val="Hyperlink"/>
-                </w:rPr>
-                <w:t>1</w:t>
-              </w:r>
-            </w:hyperlink>
-            <w:r>
-              <w:t xml:space="preserve">, </w:t>
-            </w:r>
-            <w:hyperlink r:id="rId36" w:history="1">
-              <w:r>
-                <w:rPr>
-                  <w:rStyle w:val="Hyperlink"/>
-                </w:rPr>
-                <w:t>2</w:t>
-              </w:r>
-            </w:hyperlink>
-            <w:r>
-              <w:t>]</w:t>
-            </w:r>
-          </w:p>
-          <w:p>
-            <w:pPr>
-              <w:numPr>
-                <w:ilvl w:val="0"/>
-                <w:numId w:val="30"/>
-              </w:numPr>
-            </w:pPr>
-            <w:r>
-              <w:rPr>
-                <w:b/>
-                <w:bCs/>
-              </w:rPr>
-              <w:t>When to use:</w:t>
-            </w:r>
-            <w:r>
-              <w:t xml:space="preserve"> Use this for your main API endpoints, major application services, helper utilities, or anything designed to be shared globally across packages.</w:t>
-            </w:r>
-          </w:p>
-        </w:tc>
-      </w:tr>
-      <w:tr>
-        <w:tc>
-          <w:tcPr>
-            <w:tcW w:w="10790" w:type="dxa"/>
-          </w:tcPr>
-          <w:p>
-            <w:pPr>
-              <w:rPr>
-                <w:b/>
-                <w:bCs/>
-              </w:rPr>
-            </w:pPr>
-            <w:r>
-              <w:rPr>
-                <w:b/>
-                <w:bCs/>
-              </w:rPr>
-              <w:t>Private (private)</w:t>
-            </w:r>
-          </w:p>
-          <w:p>
-            <w:r>
-              <w:t xml:space="preserve">The private modifier provides the </w:t>
-            </w:r>
-            <w:r>
-              <w:rPr>
-                <w:b/>
-                <w:bCs/>
-              </w:rPr>
-              <w:t>highest level of restriction</w:t>
-            </w:r>
-            <w:r>
-              <w:t>. Variables or methods marked private are hidden from every other class in your project—even classes inside the exact same folder (package). They can only be accessed within the specific class where they are defined. [</w:t>
-            </w:r>
             <w:hyperlink r:id="rId37" w:history="1">
               <w:r>
                 <w:rPr>
@@ -7963,9 +7890,86 @@
               </w:r>
             </w:hyperlink>
             <w:r>
+              <w:t>]</w:t>
+            </w:r>
+          </w:p>
+          <w:p>
+            <w:pPr>
+              <w:numPr>
+                <w:ilvl w:val="0"/>
+                <w:numId w:val="30"/>
+              </w:numPr>
+            </w:pPr>
+            <w:r>
+              <w:rPr>
+                <w:b/>
+                <w:bCs/>
+              </w:rPr>
+              <w:t>When to use:</w:t>
+            </w:r>
+            <w:r>
+              <w:t xml:space="preserve"> Use this for your main API endpoints, major application services, helper utilities, or anything designed to be shared globally across packages.</w:t>
+            </w:r>
+          </w:p>
+        </w:tc>
+      </w:tr>
+      <w:tr>
+        <w:tc>
+          <w:tcPr>
+            <w:tcW w:w="10790" w:type="dxa"/>
+          </w:tcPr>
+          <w:p>
+            <w:pPr>
+              <w:rPr>
+                <w:b/>
+                <w:bCs/>
+              </w:rPr>
+            </w:pPr>
+            <w:r>
+              <w:rPr>
+                <w:b/>
+                <w:bCs/>
+              </w:rPr>
+              <w:t>Private (private)</w:t>
+            </w:r>
+          </w:p>
+          <w:p>
+            <w:r>
+              <w:t xml:space="preserve">The private modifier provides the </w:t>
+            </w:r>
+            <w:r>
+              <w:rPr>
+                <w:b/>
+                <w:bCs/>
+              </w:rPr>
+              <w:t>highest level of restriction</w:t>
+            </w:r>
+            <w:r>
+              <w:t>. Variables or methods marked private are hidden from every other class in your project—even classes inside the exact same folder (package). They can only be accessed within the specific class where they are defined. [</w:t>
+            </w:r>
+            <w:hyperlink r:id="rId39" w:history="1">
+              <w:r>
+                <w:rPr>
+                  <w:rStyle w:val="Hyperlink"/>
+                </w:rPr>
+                <w:t>1</w:t>
+              </w:r>
+            </w:hyperlink>
+            <w:r>
               <w:t xml:space="preserve">, </w:t>
             </w:r>
-            <w:hyperlink r:id="rId39" w:history="1">
+            <w:hyperlink r:id="rId40" w:history="1">
+              <w:r>
+                <w:rPr>
+                  <w:rStyle w:val="Hyperlink"/>
+                </w:rPr>
+                <w:t>2</w:t>
+              </w:r>
+            </w:hyperlink>
+            <w:r>
+              <w:t xml:space="preserve">, </w:t>
+            </w:r>
+            <w:hyperlink r:id="rId41" w:history="1">
               <w:r>
                 <w:rPr>
                   <w:rStyle w:val="Hyperlink"/>
@@ -8116,7 +8120,7 @@
             <w:r>
               <w:t xml:space="preserve"> entirely hidden from the outside world. [</w:t>
             </w:r>
-            <w:hyperlink r:id="rId40" w:history="1">
+            <w:hyperlink r:id="rId42" w:history="1">
               <w:r>
                 <w:rPr>
                   <w:rStyle w:val="Hyperlink"/>
@@ -8127,7 +8131,7 @@
             <w:r>
               <w:t xml:space="preserve">, </w:t>
             </w:r>
-            <w:hyperlink r:id="rId41" w:history="1">
+            <w:hyperlink r:id="rId43" w:history="1">
               <w:r>
                 <w:rPr>
                   <w:rStyle w:val="Hyperlink"/>
@@ -8138,7 +8142,7 @@
             <w:r>
               <w:t xml:space="preserve">, </w:t>
             </w:r>
-            <w:hyperlink r:id="rId42" w:history="1">
+            <w:hyperlink r:id="rId44" w:history="1">
               <w:r>
                 <w:rPr>
                   <w:rStyle w:val="Hyperlink"/>
@@ -8174,7 +8178,7 @@
             <w:r>
               <w:t xml:space="preserve"> protect private fields? [</w:t>
             </w:r>
-            <w:hyperlink r:id="rId43" w:history="1">
+            <w:hyperlink r:id="rId45" w:history="1">
               <w:r>
                 <w:rPr>
                   <w:rStyle w:val="Hyperlink"/>
@@ -14668,7 +14672,7 @@
                           <pic:cNvPicPr/>
                         </pic:nvPicPr>
                         <pic:blipFill>
-                          <a:blip r:embed="rId44"/>
+                          <a:blip r:embed="rId46"/>
                           <a:stretch>
                             <a:fillRect/>
                           </a:stretch>
@@ -15023,7 +15027,7 @@
                           <pic:cNvPicPr/>
                         </pic:nvPicPr>
                         <pic:blipFill>
-                          <a:blip r:embed="rId45"/>
+                          <a:blip r:embed="rId47"/>
                           <a:stretch>
                             <a:fillRect/>
                           </a:stretch>
@@ -15086,7 +15090,7 @@
                           <pic:cNvPicPr/>
                         </pic:nvPicPr>
                         <pic:blipFill>
-                          <a:blip r:embed="rId46"/>
+                          <a:blip r:embed="rId48"/>
                           <a:stretch>
                             <a:fillRect/>
                           </a:stretch>
@@ -15137,7 +15141,7 @@
                           <pic:cNvPicPr/>
                         </pic:nvPicPr>
                         <pic:blipFill>
-                          <a:blip r:embed="rId47"/>
+                          <a:blip r:embed="rId49"/>
                           <a:stretch>
                             <a:fillRect/>
                           </a:stretch>
@@ -15510,7 +15514,7 @@
                           <pic:cNvPicPr/>
                         </pic:nvPicPr>
                         <pic:blipFill>
-                          <a:blip r:embed="rId48"/>
+                          <a:blip r:embed="rId50"/>
                           <a:stretch>
                             <a:fillRect/>
                           </a:stretch>
@@ -15610,7 +15614,7 @@
                           <pic:cNvPicPr/>
                         </pic:nvPicPr>
                         <pic:blipFill>
-                          <a:blip r:embed="rId49"/>
+                          <a:blip r:embed="rId51"/>
                           <a:stretch>
                             <a:fillRect/>
                           </a:stretch>
@@ -15692,7 +15696,7 @@
                           <pic:cNvPicPr/>
                         </pic:nvPicPr>
                         <pic:blipFill>
-                          <a:blip r:embed="rId50"/>
+                          <a:blip r:embed="rId52"/>
                           <a:stretch>
                             <a:fillRect/>
                           </a:stretch>
@@ -15785,7 +15789,7 @@
                     <pic:cNvPicPr/>
                   </pic:nvPicPr>
                   <pic:blipFill>
-                    <a:blip r:embed="rId51"/>
+                    <a:blip r:embed="rId53"/>
                     <a:stretch>
                       <a:fillRect/>
                     </a:stretch>
@@ -15971,7 +15975,7 @@
                     <pic:cNvPicPr/>
                   </pic:nvPicPr>
                   <pic:blipFill>
-                    <a:blip r:embed="rId52"/>
+                    <a:blip r:embed="rId54"/>
                     <a:stretch>
                       <a:fillRect/>
                     </a:stretch>
@@ -16034,7 +16038,7 @@
                           <pic:cNvPicPr/>
                         </pic:nvPicPr>
                         <pic:blipFill>
-                          <a:blip r:embed="rId53"/>
+                          <a:blip r:embed="rId55"/>
                           <a:stretch>
                             <a:fillRect/>
                           </a:stretch>
@@ -16097,7 +16101,7 @@
       <w:r>
         <w:t>ifferent types of </w:t>
       </w:r>
-      <w:hyperlink r:id="rId54" w:tgtFrame="_blank" w:history="1">
+      <w:hyperlink r:id="rId56" w:tgtFrame="_blank" w:history="1">
         <w:r>
           <w:rPr>
             <w:rStyle w:val="Hyperlink"/>
@@ -16781,7 +16785,7 @@
                     <pic:cNvPicPr/>
                   </pic:nvPicPr>
                   <pic:blipFill>
-                    <a:blip r:embed="rId55"/>
+                    <a:blip r:embed="rId57"/>
                     <a:stretch>
                       <a:fillRect/>
                     </a:stretch>
@@ -17082,8 +17086,8 @@
                 <w:noProof/>
               </w:rPr>
               <w:drawing>
-                <wp:inline distT="0" distB="0" distL="0" distR="0" wp14:anchorId="20934E78" wp14:editId="693B8079">
-                  <wp:extent cx="4495800" cy="4171950"/>
+                <wp:inline distT="0" distB="0" distL="0" distR="0" wp14:anchorId="20934E78" wp14:editId="6D196054">
+                  <wp:extent cx="4495800" cy="4057650"/>
                   <wp:effectExtent l="0" t="0" r="0" b="0"/>
                   <wp:docPr id="1014775417" name="Picture 1"/>
                   <wp:cNvGraphicFramePr>
@@ -17097,7 +17101,7 @@
                           <pic:cNvPicPr/>
                         </pic:nvPicPr>
                         <pic:blipFill>
-                          <a:blip r:embed="rId56"/>
+                          <a:blip r:embed="rId58"/>
                           <a:stretch>
                             <a:fillRect/>
                           </a:stretch>
@@ -17105,7 +17109,7 @@
                         <pic:spPr>
                           <a:xfrm>
                             <a:off x="0" y="0"/>
-                            <a:ext cx="4530042" cy="4203725"/>
+                            <a:ext cx="4530044" cy="4088557"/>
                           </a:xfrm>
                           <a:prstGeom prst="rect">
                             <a:avLst/>
@@ -17556,7 +17560,7 @@
                           </pic:cNvPicPr>
                         </pic:nvPicPr>
                         <pic:blipFill>
-                          <a:blip r:embed="rId57">
+                          <a:blip r:embed="rId59">
                             <a:extLst>
                               <a:ext uri="{28A0092B-C50C-407E-A947-70E740481C1C}">
                                 <a14:useLocalDpi xmlns:a14="http://schemas.microsoft.com/office/drawing/2010/main" val="0"/>
@@ -17701,7 +17705,7 @@
                           <pic:cNvPicPr/>
                         </pic:nvPicPr>
                         <pic:blipFill>
-                          <a:blip r:embed="rId58"/>
+                          <a:blip r:embed="rId60"/>
                           <a:stretch>
                             <a:fillRect/>
                           </a:stretch>
@@ -17878,7 +17882,7 @@
                           <pic:cNvPicPr/>
                         </pic:nvPicPr>
                         <pic:blipFill>
-                          <a:blip r:embed="rId59"/>
+                          <a:blip r:embed="rId61"/>
                           <a:stretch>
                             <a:fillRect/>
                           </a:stretch>
@@ -17929,7 +17933,7 @@
                           <pic:cNvPicPr/>
                         </pic:nvPicPr>
                         <pic:blipFill>
-                          <a:blip r:embed="rId60"/>
+                          <a:blip r:embed="rId62"/>
                           <a:stretch>
                             <a:fillRect/>
                           </a:stretch>
@@ -18321,7 +18325,7 @@
                     <pic:cNvPicPr/>
                   </pic:nvPicPr>
                   <pic:blipFill>
-                    <a:blip r:embed="rId61"/>
+                    <a:blip r:embed="rId63"/>
                     <a:stretch>
                       <a:fillRect/>
                     </a:stretch>
@@ -18365,7 +18369,7 @@
                     <pic:cNvPicPr/>
                   </pic:nvPicPr>
                   <pic:blipFill>
-                    <a:blip r:embed="rId62"/>
+                    <a:blip r:embed="rId64"/>
                     <a:stretch>
                       <a:fillRect/>
                     </a:stretch>
@@ -18582,7 +18586,7 @@
                     <pic:cNvPicPr/>
                   </pic:nvPicPr>
                   <pic:blipFill>
-                    <a:blip r:embed="rId63"/>
+                    <a:blip r:embed="rId65"/>
                     <a:stretch>
                       <a:fillRect/>
                     </a:stretch>
@@ -18626,7 +18630,7 @@
                     <pic:cNvPicPr/>
                   </pic:nvPicPr>
                   <pic:blipFill>
-                    <a:blip r:embed="rId64"/>
+                    <a:blip r:embed="rId66"/>
                     <a:stretch>
                       <a:fillRect/>
                     </a:stretch>
@@ -18669,7 +18673,7 @@
                     <pic:cNvPicPr/>
                   </pic:nvPicPr>
                   <pic:blipFill>
-                    <a:blip r:embed="rId65"/>
+                    <a:blip r:embed="rId67"/>
                     <a:stretch>
                       <a:fillRect/>
                     </a:stretch>
@@ -18900,7 +18904,7 @@
                     <pic:cNvPicPr/>
                   </pic:nvPicPr>
                   <pic:blipFill>
-                    <a:blip r:embed="rId66"/>
+                    <a:blip r:embed="rId68"/>
                     <a:stretch>
                       <a:fillRect/>
                     </a:stretch>
@@ -18951,7 +18955,7 @@
                     <pic:cNvPicPr/>
                   </pic:nvPicPr>
                   <pic:blipFill>
-                    <a:blip r:embed="rId67"/>
+                    <a:blip r:embed="rId69"/>
                     <a:stretch>
                       <a:fillRect/>
                     </a:stretch>
@@ -19096,7 +19100,7 @@
                     <pic:cNvPicPr/>
                   </pic:nvPicPr>
                   <pic:blipFill>
-                    <a:blip r:embed="rId68"/>
+                    <a:blip r:embed="rId70"/>
                     <a:stretch>
                       <a:fillRect/>
                     </a:stretch>
@@ -19494,7 +19498,7 @@
       <w:r>
         <w:t xml:space="preserve"> [</w:t>
       </w:r>
-      <w:hyperlink r:id="rId69" w:history="1">
+      <w:hyperlink r:id="rId71" w:history="1">
         <w:r>
           <w:rPr>
             <w:rStyle w:val="Hyperlink"/>
@@ -19796,7 +19800,7 @@
                     <pic:cNvPicPr/>
                   </pic:nvPicPr>
                   <pic:blipFill>
-                    <a:blip r:embed="rId70"/>
+                    <a:blip r:embed="rId72"/>
                     <a:stretch>
                       <a:fillRect/>
                     </a:stretch>
@@ -19842,7 +19846,7 @@
                     <pic:cNvPicPr/>
                   </pic:nvPicPr>
                   <pic:blipFill>
-                    <a:blip r:embed="rId71"/>
+                    <a:blip r:embed="rId73"/>
                     <a:stretch>
                       <a:fillRect/>
                     </a:stretch>
@@ -20340,7 +20344,7 @@
                     <pic:cNvPicPr/>
                   </pic:nvPicPr>
                   <pic:blipFill>
-                    <a:blip r:embed="rId72"/>
+                    <a:blip r:embed="rId74"/>
                     <a:stretch>
                       <a:fillRect/>
                     </a:stretch>
@@ -20395,7 +20399,7 @@
                     <pic:cNvPicPr/>
                   </pic:nvPicPr>
                   <pic:blipFill>
-                    <a:blip r:embed="rId73">
+                    <a:blip r:embed="rId75">
                       <a:extLst>
                         <a:ext uri="{28A0092B-C50C-407E-A947-70E740481C1C}">
                           <a14:useLocalDpi xmlns:a14="http://schemas.microsoft.com/office/drawing/2010/main" val="0"/>
@@ -21071,7 +21075,7 @@
                     <pic:cNvPicPr/>
                   </pic:nvPicPr>
                   <pic:blipFill>
-                    <a:blip r:embed="rId74"/>
+                    <a:blip r:embed="rId76"/>
                     <a:stretch>
                       <a:fillRect/>
                     </a:stretch>
@@ -21094,8 +21098,8 @@
     </w:p>
     <w:p/>
     <w:sectPr>
-      <w:headerReference w:type="default" r:id="rId75"/>
-      <w:footerReference w:type="default" r:id="rId76"/>
+      <w:headerReference w:type="default" r:id="rId77"/>
+      <w:footerReference w:type="default" r:id="rId78"/>
       <w:pgSz w:w="12240" w:h="15840"/>
       <w:pgMar w:top="0" w:right="720" w:bottom="720" w:left="720" w:header="720" w:footer="720" w:gutter="0"/>
       <w:cols w:space="720"/>
@@ -26752,6 +26756,7 @@
   <w:style w:type="character" w:default="1" w:styleId="DefaultParagraphFont">
     <w:name w:val="Default Paragraph Font"/>
     <w:uiPriority w:val="1"/>
+    <w:semiHidden/>
     <w:unhideWhenUsed/>
   </w:style>
   <w:style w:type="table" w:default="1" w:styleId="TableNormal">

</xml_diff>